<commit_message>
v0.5 - right before resubmition
</commit_message>
<xml_diff>
--- a/2026-Jornal-Doruk-ONNX/symmetry-4315123.docx
+++ b/2026-Jornal-Doruk-ONNX/symmetry-4315123.docx
@@ -266,7 +266,7 @@
         <w:rPr>
           <w:highlight w:val="yellow"/>
         </w:rPr>
-        <w:t xml:space="preserve"> ONNX models. Additionally, training durations exhibit an inverse scaling relationship with batch size, yielding massive temporal savings as workloads expand. Furthermore, larger batch sizes effectively amortize fixed execution costs across thousands of samples, reducing average per-sample latency, with static quantized configurations maintaining the most stable profiles even under small batch conditions. </w:t>
+        <w:t xml:space="preserve"> ONNX models. Additionally, training durations exhibit an inverse scaling relationship with batch size, yielding massive temporal savings as workloads expand. Furthermore, larger batch sizes effectively amortize fixed execution costs across thousands of samples, reducing average per-sample latency. </w:t>
       </w:r>
       <w:r>
         <w:rPr>
@@ -321,17 +321,14 @@
         <w:rPr>
           <w:highlight w:val="yellow"/>
         </w:rPr>
-        <w:t xml:space="preserve">These threats primarily manifest as DNS reflection and DNS resource exhaustion, which are fundamentally driven by structural and protocol asymmetries. Attackers exploit DNS servers as reflection vectors to generate high-volume traffic, leveraging minimal request payloads to elicit disproportionately amplified responses, a phenomenon known as traffic </w:t>
-      </w:r>
-      <w:r>
-        <w:rPr>
-          <w:highlight w:val="yellow"/>
-        </w:rPr>
+        <w:t>These threats primarily manifest as DNS reflection and DNS resource exhaustion, which are fundamentally driven by structural and protocol asymmetries. Attackers exploit DNS servers as reflection vectors to generate high-volume traffic, leveraging minimal request payloads to elicit disproportionately amplified responses, a phenomenon known as traffic asymmetry.</w:t>
+      </w:r>
+      <w:r>
+        <w:t xml:space="preserve"> This escalating threat landscape is evidenced by 2023 data showing a DNS compo</w:t>
+      </w:r>
+      <w:r>
         <w:lastRenderedPageBreak/>
-        <w:t>asymmetry.</w:t>
-      </w:r>
-      <w:r>
-        <w:t xml:space="preserve"> This escalating threat landscape is evidenced by 2023 data showing a DNS component in 60% of all DDoS incidents [2], followed by a staggering 80% surge in such attacks during the first quarter of 2024 [3].</w:t>
+        <w:t>nent in 60% of all DDoS incidents [2], followed by a staggering 80% surge in such attacks during the first quarter of 2024 [3].</w:t>
       </w:r>
     </w:p>
     <w:p>
@@ -484,11 +481,11 @@
       </w:r>
       <w:proofErr w:type="spellEnd"/>
       <w:r>
-        <w:t xml:space="preserve"> attack </w:t>
+        <w:t xml:space="preserve"> attack types and their characteristics. Section 4 details the experimental setup, dataset prepro</w:t>
       </w:r>
       <w:r>
         <w:lastRenderedPageBreak/>
-        <w:t xml:space="preserve">types and their characteristics. Section 4 details the experimental setup, dataset preprocessing, and feature selection procedures. The performance metrics utilized in the study are presented in Section 5. Section 6 introduces the </w:t>
+        <w:t xml:space="preserve">cessing, and feature selection procedures. The performance metrics utilized in the study are presented in Section 5. Section 6 introduces the </w:t>
       </w:r>
       <w:r>
         <w:t xml:space="preserve">tested deep learning models and their </w:t>
@@ -670,38 +667,95 @@
       </w:r>
       <w:proofErr w:type="spellEnd"/>
       <w:r>
-        <w:t xml:space="preserve"> et al. (2024), the Eye-Net model was proposed for DDoS detection in IoT environments. Using Quantization-Aware Training (QAT) with INT8 </w:t>
-      </w:r>
+        <w:t xml:space="preserve"> et al. (2024), the Eye-Net model was proposed for DDoS detection in IoT environments. Using Quantization-Aware Training (QAT) with INT8 precision, the model </w:t>
+      </w:r>
+      <w:r>
+        <w:t>achieved</w:t>
+      </w:r>
+      <w:r>
+        <w:t xml:space="preserve"> 99.99% accuracy and an F1 score of 99.99% on the CICDDoS2019 dataset [13].</w:t>
+      </w:r>
+    </w:p>
+    <w:p>
+      <w:pPr>
+        <w:pStyle w:val="MDPI31text"/>
+      </w:pPr>
+      <w:proofErr w:type="spellStart"/>
       <w:r>
         <w:lastRenderedPageBreak/>
-        <w:t xml:space="preserve">precision, the model </w:t>
-      </w:r>
-      <w:r>
-        <w:t>achieved</w:t>
-      </w:r>
-      <w:r>
-        <w:t xml:space="preserve"> 99.99% accuracy and an F1 score of 99.99% on the CICDDoS2019 dataset [13].</w:t>
+        <w:t>Nkoom</w:t>
+      </w:r>
+      <w:proofErr w:type="spellEnd"/>
+      <w:r>
+        <w:t xml:space="preserve"> et al. (2026) proposed a federated learning framework for real-time DDoS detection on Internet of Robotic Things (</w:t>
+      </w:r>
+      <w:proofErr w:type="spellStart"/>
+      <w:r>
+        <w:t>IoRT</w:t>
+      </w:r>
+      <w:proofErr w:type="spellEnd"/>
+      <w:r>
+        <w:t>) devices. Using QAT with differential privacy-based clustering, the model size was compressed from 0.52 MB to 0.13 MB. Inference speed was increased 433-fold, reducing latency to below 150 microseconds [14].</w:t>
       </w:r>
     </w:p>
     <w:p>
       <w:pPr>
         <w:pStyle w:val="MDPI31text"/>
       </w:pPr>
-      <w:proofErr w:type="spellStart"/>
-      <w:r>
+      <w:r>
+        <w:t xml:space="preserve">Most studies focusing on </w:t>
+      </w:r>
+      <w:proofErr w:type="spellStart"/>
+      <w:r>
+        <w:t>DrDoS</w:t>
+      </w:r>
+      <w:proofErr w:type="spellEnd"/>
+      <w:r>
+        <w:t xml:space="preserve"> and DDoS detection in the literature aim to reduce inference times to the millisecond range through lightweight architectures (LUCID [7]) or feature optimization [8]. </w:t>
+      </w:r>
+      <w:r>
+        <w:rPr>
+          <w:highlight w:val="yellow"/>
+        </w:rPr>
+        <w:t xml:space="preserve">In contrast, the ONNX-based MLP model presented in this study achieves an inference time </w:t>
+      </w:r>
+      <w:r>
+        <w:rPr>
+          <w:highlight w:val="yellow"/>
+        </w:rPr>
+        <w:t xml:space="preserve">of </w:t>
+      </w:r>
+      <w:r>
+        <w:rPr>
+          <w:highlight w:val="yellow"/>
+        </w:rPr>
+        <w:t>89.5</w:t>
+      </w:r>
+      <w:r>
+        <w:rPr>
+          <w:highlight w:val="yellow"/>
+        </w:rPr>
+        <w:t xml:space="preserve"> nanoseconds on </w:t>
+      </w:r>
+      <w:r>
+        <w:rPr>
+          <w:highlight w:val="yellow"/>
+        </w:rPr>
+        <w:t xml:space="preserve">the GPU, significantly outperforming the performance metrics of </w:t>
+      </w:r>
+      <w:proofErr w:type="spellStart"/>
+      <w:r>
+        <w:rPr>
+          <w:highlight w:val="yellow"/>
+        </w:rPr>
         <w:t>Nkoom</w:t>
       </w:r>
       <w:proofErr w:type="spellEnd"/>
       <w:r>
-        <w:t xml:space="preserve"> et al. (2026) proposed a federated learning framework for real-time DDoS detection on Internet of Robotic Things (</w:t>
-      </w:r>
-      <w:proofErr w:type="spellStart"/>
-      <w:r>
-        <w:t>IoRT</w:t>
-      </w:r>
-      <w:proofErr w:type="spellEnd"/>
-      <w:r>
-        <w:t>) devices. Using QAT with differential privacy-based clustering, the model size was compressed from 0.52 MB to 0.13 MB. Inference speed was increased 433-fold, reducing latency to below 150 microseconds [14].</w:t>
+        <w:rPr>
+          <w:highlight w:val="yellow"/>
+        </w:rPr>
+        <w:t xml:space="preserve"> et al. [14].</w:t>
       </w:r>
     </w:p>
     <w:p>
@@ -709,7 +763,58 @@
         <w:pStyle w:val="MDPI31text"/>
       </w:pPr>
       <w:r>
-        <w:t xml:space="preserve">Most studies focusing on </w:t>
+        <w:t xml:space="preserve">Regarding model compression and memory efficiency, Sharmila and </w:t>
+      </w:r>
+      <w:proofErr w:type="spellStart"/>
+      <w:r>
+        <w:t>Nagapadma</w:t>
+      </w:r>
+      <w:proofErr w:type="spellEnd"/>
+      <w:r>
+        <w:t xml:space="preserve"> [12] achieved a 92.23% reduction in size using a QAE. </w:t>
+      </w:r>
+      <w:r>
+        <w:rPr>
+          <w:highlight w:val="yellow"/>
+        </w:rPr>
+        <w:t xml:space="preserve">In this study, the application of Post-Training Quantization (PTQ) and ONNX optimization achieved </w:t>
+      </w:r>
+      <w:r>
+        <w:rPr>
+          <w:highlight w:val="yellow"/>
+        </w:rPr>
+        <w:t>up to</w:t>
+      </w:r>
+      <w:r>
+        <w:rPr>
+          <w:highlight w:val="yellow"/>
+        </w:rPr>
+        <w:t xml:space="preserve"> 89% reduction in file size without requiring complex retraining processes. Furthermore, the proposed system can process over </w:t>
+      </w:r>
+      <w:r>
+        <w:rPr>
+          <w:highlight w:val="yellow"/>
+        </w:rPr>
+        <w:t>ten</w:t>
+      </w:r>
+      <w:r>
+        <w:rPr>
+          <w:highlight w:val="yellow"/>
+        </w:rPr>
+        <w:t xml:space="preserve"> million inferences per second at a batch size of 4096, compared to the throughput of 55,000 samples per second achieved by the LUCID [7] model.</w:t>
+      </w:r>
+    </w:p>
+    <w:p>
+      <w:pPr>
+        <w:pStyle w:val="MDPI31text"/>
+      </w:pPr>
+    </w:p>
+    <w:p>
+      <w:pPr>
+        <w:pStyle w:val="MDPI21heading1"/>
+      </w:pPr>
+      <w:r>
+        <w:t xml:space="preserve">3. Classification of </w:t>
       </w:r>
       <w:proofErr w:type="spellStart"/>
       <w:r>
@@ -717,39 +822,7 @@
       </w:r>
       <w:proofErr w:type="spellEnd"/>
       <w:r>
-        <w:t xml:space="preserve"> and DDoS detection in the literature aim to reduce inference times to the millisecond range through lightweight architectures (LUCID [7]) or feature optimization [8]. </w:t>
-      </w:r>
-      <w:r>
-        <w:rPr>
-          <w:highlight w:val="yellow"/>
-        </w:rPr>
-        <w:t xml:space="preserve">In contrast, the ONNX-based MLP model presented in this study achieves an inference time of </w:t>
-      </w:r>
-      <w:r>
-        <w:rPr>
-          <w:highlight w:val="yellow"/>
-        </w:rPr>
-        <w:t>99,6</w:t>
-      </w:r>
-      <w:r>
-        <w:rPr>
-          <w:highlight w:val="yellow"/>
-        </w:rPr>
-        <w:t xml:space="preserve"> nanoseconds on the GPU, significantly outperforming the performance metrics of </w:t>
-      </w:r>
-      <w:proofErr w:type="spellStart"/>
-      <w:r>
-        <w:rPr>
-          <w:highlight w:val="yellow"/>
-        </w:rPr>
-        <w:t>Nkoom</w:t>
-      </w:r>
-      <w:proofErr w:type="spellEnd"/>
-      <w:r>
-        <w:rPr>
-          <w:highlight w:val="yellow"/>
-        </w:rPr>
-        <w:t xml:space="preserve"> et al. [14].</w:t>
+        <w:t xml:space="preserve"> Attacks</w:t>
       </w:r>
     </w:p>
     <w:p>
@@ -757,194 +830,130 @@
         <w:pStyle w:val="MDPI31text"/>
       </w:pPr>
       <w:r>
-        <w:t xml:space="preserve">Regarding model compression and memory efficiency, Sharmila and </w:t>
-      </w:r>
-      <w:proofErr w:type="spellStart"/>
-      <w:r>
-        <w:t>Nagapadma</w:t>
-      </w:r>
-      <w:proofErr w:type="spellEnd"/>
-      <w:r>
-        <w:t xml:space="preserve"> [12] achieved a 92.23% reduction in size using a QAE. </w:t>
-      </w:r>
-      <w:r>
-        <w:rPr>
-          <w:highlight w:val="yellow"/>
-        </w:rPr>
-        <w:t xml:space="preserve">In this study, the application of Post-Training Quantization (PTQ) and ONNX optimization achieved </w:t>
-      </w:r>
-      <w:r>
-        <w:rPr>
-          <w:highlight w:val="yellow"/>
-        </w:rPr>
-        <w:t>up to</w:t>
-      </w:r>
-      <w:r>
-        <w:rPr>
-          <w:highlight w:val="yellow"/>
-        </w:rPr>
-        <w:t xml:space="preserve"> 89% reduction in file size without requiring complex retraining processes. Furthermore, the proposed system can process over </w:t>
-      </w:r>
-      <w:r>
-        <w:rPr>
-          <w:highlight w:val="yellow"/>
-        </w:rPr>
-        <w:t>ten</w:t>
-      </w:r>
-      <w:r>
-        <w:rPr>
-          <w:highlight w:val="yellow"/>
-        </w:rPr>
-        <w:t xml:space="preserve"> million inferences per second at a batch size of 4096, compared to the throughput of 55,000 samples per second achieved by the LUCID [7] model.</w:t>
+        <w:t>DNS Distributed Reflection and Amplification (</w:t>
+      </w:r>
+      <w:proofErr w:type="spellStart"/>
+      <w:r>
+        <w:t>DrDoS</w:t>
+      </w:r>
+      <w:proofErr w:type="spellEnd"/>
+      <w:r>
+        <w:t xml:space="preserve">) attacks represent a significant security threat that leverages the DNS infrastructure to cause service disruption and network congestion. By exploiting open DNS resolvers and the inherent discrepancies in response sizes within the DNS protocol, these attacks aim to overwhelm targeted systems with massive volumes of spoofed traffic [15]. </w:t>
+      </w:r>
+      <w:proofErr w:type="spellStart"/>
+      <w:r>
+        <w:t>DrDoS</w:t>
+      </w:r>
+      <w:proofErr w:type="spellEnd"/>
+      <w:r>
+        <w:t xml:space="preserve"> DNS attacks can be categorized into four primary classifications based on [16]:</w:t>
+      </w:r>
+    </w:p>
+    <w:p>
+      <w:pPr>
+        <w:pStyle w:val="MDPI38bullet"/>
+      </w:pPr>
+      <w:r>
+        <w:t>DNS Record Type Employed</w:t>
+      </w:r>
+    </w:p>
+    <w:p>
+      <w:pPr>
+        <w:pStyle w:val="MDPI38bullet"/>
+      </w:pPr>
+      <w:r>
+        <w:t>Amplification Factor</w:t>
+      </w:r>
+    </w:p>
+    <w:p>
+      <w:pPr>
+        <w:pStyle w:val="MDPI38bullet"/>
+      </w:pPr>
+      <w:r>
+        <w:t>Targeted DNS Infrastructure</w:t>
+      </w:r>
+    </w:p>
+    <w:p>
+      <w:pPr>
+        <w:pStyle w:val="MDPI38bullet"/>
+      </w:pPr>
+      <w:r>
+        <w:t>Attack Vector</w:t>
+      </w:r>
+    </w:p>
+    <w:p>
+      <w:pPr>
+        <w:pStyle w:val="MDPI22heading2"/>
+      </w:pPr>
+      <w:r>
+        <w:t>3.1. Classification Based on the DNS Record Type Employed</w:t>
       </w:r>
     </w:p>
     <w:p>
       <w:pPr>
         <w:pStyle w:val="MDPI31text"/>
       </w:pPr>
-    </w:p>
-    <w:p>
-      <w:pPr>
-        <w:pStyle w:val="MDPI21heading1"/>
-      </w:pPr>
-      <w:r>
-        <w:t xml:space="preserve">3. Classification of </w:t>
-      </w:r>
+      <w:r>
+        <w:t>Attackers utilize various DNS record types to maximize the reflection and amplification effects. While ANY queries generate high-volume traffic by producing large responses that include all available DNS records, attacks based on TXT records allow for massive responses to be derived from small queries due to the length of text-based entries. Similarly, attacks leveraging MX and NS records result in large responses containing lists of multiple mail servers or authoritative name servers. Furthermore, AAAA records increase the response size due to the length of IPv6 addresses, while CNAME records can indirectly escalate the traffic load by triggering additional recursive queries.</w:t>
+      </w:r>
+    </w:p>
+    <w:p>
+      <w:pPr>
+        <w:pStyle w:val="MDPI22heading2"/>
+      </w:pPr>
+      <w:r>
+        <w:t>3.2. Classification Based on the Amplification Factor</w:t>
+      </w:r>
+    </w:p>
+    <w:p>
+      <w:pPr>
+        <w:pStyle w:val="MDPI31text"/>
+      </w:pPr>
+      <w:r>
+        <w:rPr>
+          <w:highlight w:val="yellow"/>
+        </w:rPr>
+        <w:t xml:space="preserve">The potential impact of an attack is determined by the amplification factor, which denotes the </w:t>
+      </w:r>
+      <w:r>
+        <w:rPr>
+          <w:highlight w:val="yellow"/>
+        </w:rPr>
+        <w:t>ratio of the response size received to the size of the submitted query</w:t>
+      </w:r>
+      <w:r>
+        <w:rPr>
+          <w:highlight w:val="yellow"/>
+        </w:rPr>
+        <w:t>.</w:t>
+      </w:r>
+      <w:r>
+        <w:t xml:space="preserve"> Although low amplification factor attacks generate responses with lower volumes, their impact is compounded by a high frequency of queries. In medium amplification factor attacks, the responses are larger, making the attack's impact more pronounced. Finally, high amplification factor attacks enable attackers to elicit exceptionally large responses using minimal query data.</w:t>
+      </w:r>
+    </w:p>
+    <w:p>
+      <w:pPr>
+        <w:pStyle w:val="MDPI22heading2"/>
+      </w:pPr>
+      <w:r>
+        <w:t>3.3. Classification Based on the Targeted DNS Infrastructure</w:t>
+      </w:r>
+    </w:p>
+    <w:p>
+      <w:pPr>
+        <w:pStyle w:val="MDPI31text"/>
+      </w:pPr>
       <w:proofErr w:type="spellStart"/>
       <w:r>
         <w:t>DrDoS</w:t>
       </w:r>
       <w:proofErr w:type="spellEnd"/>
       <w:r>
-        <w:t xml:space="preserve"> Attacks</w:t>
-      </w:r>
-    </w:p>
-    <w:p>
-      <w:pPr>
-        <w:pStyle w:val="MDPI31text"/>
-      </w:pPr>
-      <w:r>
-        <w:t>DNS Distributed Reflection and Amplification (</w:t>
-      </w:r>
-      <w:proofErr w:type="spellStart"/>
-      <w:r>
-        <w:t>DrDoS</w:t>
-      </w:r>
-      <w:proofErr w:type="spellEnd"/>
-      <w:r>
-        <w:t xml:space="preserve">) attacks represent a significant security threat that leverages the DNS infrastructure to cause service disruption and network congestion. By exploiting open DNS resolvers and the inherent discrepancies in response sizes within the DNS protocol, these attacks aim to overwhelm targeted systems with massive volumes of spoofed traffic [15]. </w:t>
-      </w:r>
-      <w:proofErr w:type="spellStart"/>
-      <w:r>
-        <w:t>DrDoS</w:t>
-      </w:r>
-      <w:proofErr w:type="spellEnd"/>
-      <w:r>
-        <w:t xml:space="preserve"> DNS attacks can be categorized into four primary classifications based on [16]:</w:t>
-      </w:r>
-    </w:p>
-    <w:p>
-      <w:pPr>
-        <w:pStyle w:val="MDPI38bullet"/>
-      </w:pPr>
-      <w:r>
-        <w:t>DNS Record Type Employed</w:t>
-      </w:r>
-    </w:p>
-    <w:p>
-      <w:pPr>
-        <w:pStyle w:val="MDPI38bullet"/>
-      </w:pPr>
-      <w:r>
-        <w:t>Amplification Factor</w:t>
-      </w:r>
-    </w:p>
-    <w:p>
-      <w:pPr>
-        <w:pStyle w:val="MDPI38bullet"/>
-      </w:pPr>
-      <w:r>
-        <w:t>Targeted DNS Infrastructure</w:t>
-      </w:r>
-    </w:p>
-    <w:p>
-      <w:pPr>
-        <w:pStyle w:val="MDPI38bullet"/>
-      </w:pPr>
-      <w:r>
-        <w:t>Attack Vector</w:t>
-      </w:r>
-    </w:p>
-    <w:p>
-      <w:pPr>
-        <w:pStyle w:val="MDPI22heading2"/>
-      </w:pPr>
-      <w:r>
-        <w:t>3.1. Classification Based on the DNS Record Type Employed</w:t>
-      </w:r>
-    </w:p>
-    <w:p>
-      <w:pPr>
-        <w:pStyle w:val="MDPI31text"/>
-      </w:pPr>
-      <w:r>
-        <w:t>Attackers utilize various DNS record types to maximize the reflection and amplification effects. While ANY queries generate high-volume traffic by producing large responses that include all available DNS records, attacks based on TXT records allow for massive responses to be derived from small queries due to the length of text-based entries. Similarly, attacks leveraging MX and NS records result in large responses containing lists of multiple mail servers or authoritative name servers. Furthermore, AAAA records increase the response size due to the length of IPv6 addresses, while CNAME records can indirectly escalate the traffic load by triggering additional recursive queries.</w:t>
-      </w:r>
-    </w:p>
-    <w:p>
-      <w:pPr>
-        <w:pStyle w:val="MDPI22heading2"/>
-      </w:pPr>
-      <w:r>
-        <w:t>3.2. Classification Based on the Amplification Factor</w:t>
-      </w:r>
-    </w:p>
-    <w:p>
-      <w:pPr>
-        <w:pStyle w:val="MDPI31text"/>
-      </w:pPr>
-      <w:r>
-        <w:rPr>
-          <w:highlight w:val="yellow"/>
-        </w:rPr>
-        <w:t xml:space="preserve">The potential impact of an attack is determined by the amplification factor, which denotes the </w:t>
-      </w:r>
-      <w:r>
-        <w:rPr>
-          <w:highlight w:val="yellow"/>
-        </w:rPr>
-        <w:t>ratio of the response size received to the size of the submitted query</w:t>
-      </w:r>
-      <w:r>
-        <w:rPr>
-          <w:highlight w:val="yellow"/>
-        </w:rPr>
-        <w:t>.</w:t>
-      </w:r>
-      <w:r>
-        <w:t xml:space="preserve"> Although low amplification factor attacks generate responses with lower volumes, their impact is compounded by a high frequency of queries. In medium amplification factor attacks, the responses are larger, making the attack's impact more pronounced. Finally, high amplification factor attacks enable attackers to elicit exceptionally large responses using minimal query data.</w:t>
-      </w:r>
-    </w:p>
-    <w:p>
-      <w:pPr>
-        <w:pStyle w:val="MDPI22heading2"/>
-      </w:pPr>
-      <w:r>
-        <w:t>3.3. Classification Based on the Targeted DNS Infrastructure</w:t>
-      </w:r>
-    </w:p>
-    <w:p>
-      <w:pPr>
-        <w:pStyle w:val="MDPI31text"/>
-      </w:pPr>
-      <w:proofErr w:type="spellStart"/>
+        <w:t xml:space="preserve"> attacks can target various components of the DNS infrastructure within a network. Based on these targets, attack types are classified as Recursive Resolver attacks, which utilize open resolvers as reflectors. Alternatively, authoritative name servers may </w:t>
+      </w:r>
       <w:r>
         <w:lastRenderedPageBreak/>
-        <w:t>DrDoS</w:t>
-      </w:r>
-      <w:proofErr w:type="spellEnd"/>
-      <w:r>
-        <w:t xml:space="preserve"> attacks can target various components of the DNS infrastructure within a network. Based on these targets, attack types are classified as Recursive Resolver attacks, which utilize open resolvers as reflectors. Alternatively, authoritative name servers may be targeted directly to induce resource exhaustion. Vulnerabilities in DNSSEC are also frequently exploited, as its validation processes require intensive computational resources.</w:t>
+        <w:t>be targeted directly to induce resource exhaustion. Vulnerabilities in DNSSEC are also frequently exploited, as its validation processes require intensive computational resources.</w:t>
       </w:r>
     </w:p>
     <w:p>
@@ -1139,8 +1148,8 @@
           <w:snapToGrid/>
         </w:rPr>
         <w:drawing>
-          <wp:inline distT="0" distB="0" distL="0" distR="0" wp14:anchorId="74F4CABA" wp14:editId="11A8EFA3">
-            <wp:extent cx="3342462" cy="6537960"/>
+          <wp:inline distT="0" distB="0" distL="0" distR="0" wp14:anchorId="74F4CABA" wp14:editId="4DA94C2D">
+            <wp:extent cx="3342462" cy="6537958"/>
             <wp:effectExtent l="0" t="0" r="0" b="0"/>
             <wp:docPr id="533850747" name="Resim 2"/>
             <wp:cNvGraphicFramePr>
@@ -1162,7 +1171,7 @@
                   <pic:spPr>
                     <a:xfrm>
                       <a:off x="0" y="0"/>
-                      <a:ext cx="3342462" cy="6537960"/>
+                      <a:ext cx="3342462" cy="6537958"/>
                     </a:xfrm>
                     <a:prstGeom prst="rect">
                       <a:avLst/>
@@ -1395,7 +1404,7 @@
         <w:t>Protocol’</w:t>
       </w:r>
       <w:r>
-        <w:t xml:space="preserve"> which exhibit low diversity and could negatively impact generalization — were removed, along with the '</w:t>
+        <w:t xml:space="preserve"> which exhibit low diversity and could negatively impact generalization were removed, along with the '</w:t>
       </w:r>
       <w:proofErr w:type="spellStart"/>
       <w:r>
@@ -1567,7 +1576,7 @@
         <w:rPr>
           <w:highlight w:val="yellow"/>
         </w:rPr>
-        <w:t>To analyze processing delay, specifically inference delay, we selected the maximum feature set consisting of 15 features based on Mutual Information scores. These features are presented in Table 1.</w:t>
+        <w:t>To analyze processing delay, specifically inference delay, we selected the maximum feature set based on Mutual Information scores. These features are presented in Table 1.</w:t>
       </w:r>
     </w:p>
     <w:p>
@@ -1799,7 +1808,7 @@
               <w:rPr>
                 <w:highlight w:val="yellow"/>
               </w:rPr>
-              <w:t xml:space="preserve"> Packet Length Max, Max Packet Length</w:t>
+              <w:t xml:space="preserve"> Packet Length Max, </w:t>
             </w:r>
           </w:p>
         </w:tc>
@@ -1879,154 +1888,6 @@
           <w:tcPr>
             <w:tcW w:w="3000" w:type="dxa"/>
             <w:tcBorders>
-              <w:top w:val="nil"/>
-              <w:bottom w:val="nil"/>
-            </w:tcBorders>
-            <w:vAlign w:val="center"/>
-          </w:tcPr>
-          <w:p>
-            <w:pPr>
-              <w:pStyle w:val="MDPI42tablebody"/>
-              <w:rPr>
-                <w:highlight w:val="yellow"/>
-              </w:rPr>
-            </w:pPr>
-            <w:r>
-              <w:rPr>
-                <w:highlight w:val="yellow"/>
-              </w:rPr>
-              <w:t>Time Features</w:t>
-            </w:r>
-          </w:p>
-        </w:tc>
-        <w:tc>
-          <w:tcPr>
-            <w:tcW w:w="7465" w:type="dxa"/>
-            <w:tcBorders>
-              <w:top w:val="nil"/>
-              <w:bottom w:val="nil"/>
-            </w:tcBorders>
-            <w:vAlign w:val="center"/>
-          </w:tcPr>
-          <w:p>
-            <w:pPr>
-              <w:pStyle w:val="MDPI42tablebody"/>
-              <w:rPr>
-                <w:highlight w:val="yellow"/>
-              </w:rPr>
-            </w:pPr>
-            <w:r>
-              <w:rPr>
-                <w:highlight w:val="yellow"/>
-              </w:rPr>
-              <w:t xml:space="preserve">Flow Duration, </w:t>
-            </w:r>
-            <w:proofErr w:type="spellStart"/>
-            <w:r>
-              <w:rPr>
-                <w:highlight w:val="yellow"/>
-              </w:rPr>
-              <w:t>Bwd</w:t>
-            </w:r>
-            <w:proofErr w:type="spellEnd"/>
-            <w:r>
-              <w:rPr>
-                <w:highlight w:val="yellow"/>
-              </w:rPr>
-              <w:t xml:space="preserve"> IAT Total, </w:t>
-            </w:r>
-            <w:proofErr w:type="spellStart"/>
-            <w:r>
-              <w:rPr>
-                <w:highlight w:val="yellow"/>
-              </w:rPr>
-              <w:t>Fwd</w:t>
-            </w:r>
-            <w:proofErr w:type="spellEnd"/>
-            <w:r>
-              <w:rPr>
-                <w:highlight w:val="yellow"/>
-              </w:rPr>
-              <w:t xml:space="preserve"> IAT Max, </w:t>
-            </w:r>
-            <w:proofErr w:type="spellStart"/>
-            <w:r>
-              <w:rPr>
-                <w:highlight w:val="yellow"/>
-              </w:rPr>
-              <w:t>Fwd</w:t>
-            </w:r>
-            <w:proofErr w:type="spellEnd"/>
-            <w:r>
-              <w:rPr>
-                <w:highlight w:val="yellow"/>
-              </w:rPr>
-              <w:t xml:space="preserve"> IAT Mean</w:t>
-            </w:r>
-          </w:p>
-        </w:tc>
-      </w:tr>
-      <w:tr>
-        <w:trPr>
-          <w:jc w:val="center"/>
-        </w:trPr>
-        <w:tc>
-          <w:tcPr>
-            <w:tcW w:w="3000" w:type="dxa"/>
-            <w:tcBorders>
-              <w:top w:val="nil"/>
-              <w:bottom w:val="nil"/>
-            </w:tcBorders>
-            <w:vAlign w:val="center"/>
-          </w:tcPr>
-          <w:p>
-            <w:pPr>
-              <w:pStyle w:val="MDPI42tablebody"/>
-              <w:rPr>
-                <w:highlight w:val="yellow"/>
-              </w:rPr>
-            </w:pPr>
-            <w:r>
-              <w:rPr>
-                <w:highlight w:val="yellow"/>
-              </w:rPr>
-              <w:t>Header / Flag Features</w:t>
-            </w:r>
-          </w:p>
-        </w:tc>
-        <w:tc>
-          <w:tcPr>
-            <w:tcW w:w="7465" w:type="dxa"/>
-            <w:tcBorders>
-              <w:top w:val="nil"/>
-              <w:bottom w:val="nil"/>
-            </w:tcBorders>
-            <w:vAlign w:val="center"/>
-          </w:tcPr>
-          <w:p>
-            <w:pPr>
-              <w:pStyle w:val="MDPI42tablebody"/>
-              <w:rPr>
-                <w:highlight w:val="yellow"/>
-              </w:rPr>
-            </w:pPr>
-            <w:r>
-              <w:rPr>
-                <w:highlight w:val="yellow"/>
-              </w:rPr>
-              <w:t>URG Flag Count</w:t>
-            </w:r>
-          </w:p>
-        </w:tc>
-      </w:tr>
-      <w:tr>
-        <w:trPr>
-          <w:jc w:val="center"/>
-        </w:trPr>
-        <w:tc>
-          <w:tcPr>
-            <w:tcW w:w="3000" w:type="dxa"/>
-            <w:tcBorders>
               <w:bottom w:val="single" w:sz="8" w:space="0" w:color="auto"/>
             </w:tcBorders>
             <w:vAlign w:val="center"/>
@@ -2038,12 +1899,6 @@
                 <w:highlight w:val="yellow"/>
               </w:rPr>
             </w:pPr>
-            <w:r>
-              <w:rPr>
-                <w:highlight w:val="yellow"/>
-              </w:rPr>
-              <w:t>Ratio Based Features</w:t>
-            </w:r>
           </w:p>
         </w:tc>
         <w:tc>
@@ -2057,13 +1912,10 @@
           <w:p>
             <w:pPr>
               <w:pStyle w:val="MDPI42tablebody"/>
+              <w:rPr>
+                <w:highlight w:val="cyan"/>
+              </w:rPr>
             </w:pPr>
-            <w:r>
-              <w:rPr>
-                <w:highlight w:val="yellow"/>
-              </w:rPr>
-              <w:t>Down/Up Ratio</w:t>
-            </w:r>
           </w:p>
         </w:tc>
       </w:tr>
@@ -3355,26 +3207,28 @@
     <w:p>
       <w:pPr>
         <w:pStyle w:val="MDPI31text"/>
-        <w:rPr>
-          <w:highlight w:val="yellow"/>
-        </w:rPr>
-      </w:pPr>
-      <w:r>
-        <w:rPr>
-          <w:highlight w:val="yellow"/>
-        </w:rPr>
-        <w:t>To evaluate model efficacy, testing was performed on a down-sampled, balanced dataset. To assess performance under a worst-case scenario for training and inference complexity, the models were trained using the maximum feature set of 15 features.</w:t>
-      </w:r>
-    </w:p>
-    <w:p>
-      <w:pPr>
-        <w:pStyle w:val="MDPI31text"/>
-      </w:pPr>
-      <w:r>
-        <w:rPr>
-          <w:highlight w:val="yellow"/>
-        </w:rPr>
-        <w:t xml:space="preserve">Table </w:t>
+      </w:pPr>
+      <w:r>
+        <w:rPr>
+          <w:highlight w:val="yellow"/>
+        </w:rPr>
+        <w:t xml:space="preserve">To evaluate model efficacy, testing was performed on a down-sampled, balanced </w:t>
+      </w:r>
+      <w:proofErr w:type="spellStart"/>
+      <w:proofErr w:type="gramStart"/>
+      <w:r>
+        <w:rPr>
+          <w:highlight w:val="yellow"/>
+        </w:rPr>
+        <w:t>dataset.Table</w:t>
+      </w:r>
+      <w:proofErr w:type="spellEnd"/>
+      <w:proofErr w:type="gramEnd"/>
+      <w:r>
+        <w:rPr>
+          <w:highlight w:val="yellow"/>
+        </w:rPr>
+        <w:t xml:space="preserve"> </w:t>
       </w:r>
       <w:r>
         <w:rPr>
@@ -3386,19 +3240,7 @@
         <w:rPr>
           <w:highlight w:val="yellow"/>
         </w:rPr>
-        <w:t xml:space="preserve"> presents the performance metrics for all three developed architectures: the Multilayer Perceptron (MLP), Convolutional Neural Network (CNN), and Gated Recurrent Unit (GRU). To ensure statistical robustness and consistency, 100 independent training iterations were executed for each architecture, with an optimal decision threshold uniquely determined during each run. The evaluation metrics reported in Table </w:t>
-      </w:r>
-      <w:r>
-        <w:rPr>
-          <w:highlight w:val="yellow"/>
-        </w:rPr>
-        <w:t>2</w:t>
-      </w:r>
-      <w:r>
-        <w:rPr>
-          <w:highlight w:val="yellow"/>
-        </w:rPr>
-        <w:t xml:space="preserve"> represent the mean values derived across these 100 iterations.</w:t>
+        <w:t xml:space="preserve"> presents the performance metrics for all three developed architectures: the Multilayer Perceptron (MLP), Convolutional Neural Network (CNN), and Gated Recurrent Unit (GRU). To ensure statistical robustness and consistency, independent training iterations were executed for each architecture, with an optimal decision threshold uniquely determined during each run. </w:t>
       </w:r>
     </w:p>
     <w:p>
@@ -4725,9 +4567,9 @@
           <w:snapToGrid/>
         </w:rPr>
         <w:drawing>
-          <wp:inline distT="0" distB="0" distL="0" distR="0" wp14:anchorId="171E3DE9" wp14:editId="0D35270F">
-            <wp:extent cx="2419350" cy="2469000"/>
-            <wp:effectExtent l="0" t="0" r="0" b="7620"/>
+          <wp:inline distT="0" distB="0" distL="0" distR="0" wp14:anchorId="171E3DE9" wp14:editId="60A25B84">
+            <wp:extent cx="2424545" cy="2474303"/>
+            <wp:effectExtent l="0" t="0" r="0" b="2540"/>
             <wp:docPr id="553307038" name="Resim 29"/>
             <wp:cNvGraphicFramePr>
               <a:graphicFrameLocks xmlns:a="http://schemas.openxmlformats.org/drawingml/2006/main" noChangeAspect="1"/>
@@ -4748,7 +4590,7 @@
                   <pic:spPr>
                     <a:xfrm>
                       <a:off x="0" y="0"/>
-                      <a:ext cx="2424547" cy="2474303"/>
+                      <a:ext cx="2424545" cy="2474303"/>
                     </a:xfrm>
                     <a:prstGeom prst="rect">
                       <a:avLst/>
@@ -4990,7 +4832,13 @@
         <w:pStyle w:val="MDPI22heading2"/>
       </w:pPr>
       <w:r>
-        <w:t>8.3. ONNX Conversion and Inference Performance Comparison</w:t>
+        <w:t>8.</w:t>
+      </w:r>
+      <w:r>
+        <w:t>2</w:t>
+      </w:r>
+      <w:r>
+        <w:t>. ONNX Conversion and Inference Performance Comparison</w:t>
       </w:r>
     </w:p>
     <w:p>
@@ -5086,7 +4934,22 @@
       </w:r>
       <w:proofErr w:type="spellEnd"/>
       <w:r>
-        <w:t xml:space="preserve"> model. The top-performing ONNX-GPU configuration for the MLP model (99.6 nanoseconds) executed inference approximately 43 times faster than the </w:t>
+        <w:t xml:space="preserve"> model. The top-performing ONNX-GPU configuration for the </w:t>
+      </w:r>
+      <w:r>
+        <w:t>MLP model (</w:t>
+      </w:r>
+      <w:r>
+        <w:t>89.5</w:t>
+      </w:r>
+      <w:r>
+        <w:t xml:space="preserve"> nanoseconds) executed inference approximately 4</w:t>
+      </w:r>
+      <w:r>
+        <w:t>7</w:t>
+      </w:r>
+      <w:r>
+        <w:t xml:space="preserve"> times faster than the </w:t>
       </w:r>
       <w:proofErr w:type="spellStart"/>
       <w:r>
@@ -5094,7 +4957,13 @@
       </w:r>
       <w:proofErr w:type="spellEnd"/>
       <w:r>
-        <w:t xml:space="preserve">-CPU configuration (4.3284 microseconds). The initial </w:t>
+        <w:t>-CPU configuration (4.</w:t>
+      </w:r>
+      <w:r>
+        <w:t>2715</w:t>
+      </w:r>
+      <w:r>
+        <w:t xml:space="preserve"> microseconds). The initial </w:t>
       </w:r>
       <w:proofErr w:type="spellStart"/>
       <w:r>
@@ -5366,7 +5235,13 @@
               <w:rPr>
                 <w:highlight w:val="yellow"/>
               </w:rPr>
-              <w:t>4.3284</w:t>
+              <w:t>4.</w:t>
+            </w:r>
+            <w:r>
+              <w:rPr>
+                <w:highlight w:val="yellow"/>
+              </w:rPr>
+              <w:t>2715</w:t>
             </w:r>
           </w:p>
         </w:tc>
@@ -5469,7 +5344,13 @@
               <w:rPr>
                 <w:highlight w:val="yellow"/>
               </w:rPr>
-              <w:t>2.5429</w:t>
+              <w:t>2.5</w:t>
+            </w:r>
+            <w:r>
+              <w:rPr>
+                <w:highlight w:val="yellow"/>
+              </w:rPr>
+              <w:t>726</w:t>
             </w:r>
           </w:p>
         </w:tc>
@@ -5570,7 +5451,13 @@
               <w:rPr>
                 <w:highlight w:val="yellow"/>
               </w:rPr>
-              <w:t>0.7982</w:t>
+              <w:t>0.7</w:t>
+            </w:r>
+            <w:r>
+              <w:rPr>
+                <w:highlight w:val="yellow"/>
+              </w:rPr>
+              <w:t>476</w:t>
             </w:r>
           </w:p>
         </w:tc>
@@ -5671,7 +5558,13 @@
               <w:rPr>
                 <w:highlight w:val="yellow"/>
               </w:rPr>
-              <w:t>0.0996</w:t>
+              <w:t>0.0</w:t>
+            </w:r>
+            <w:r>
+              <w:rPr>
+                <w:highlight w:val="yellow"/>
+              </w:rPr>
+              <w:t>895</w:t>
             </w:r>
           </w:p>
         </w:tc>
@@ -5772,7 +5665,13 @@
               <w:rPr>
                 <w:highlight w:val="yellow"/>
               </w:rPr>
-              <w:t>0.6524</w:t>
+              <w:t>0.65</w:t>
+            </w:r>
+            <w:r>
+              <w:rPr>
+                <w:highlight w:val="yellow"/>
+              </w:rPr>
+              <w:t>17</w:t>
             </w:r>
           </w:p>
         </w:tc>
@@ -5796,7 +5695,13 @@
               <w:rPr>
                 <w:highlight w:val="yellow"/>
               </w:rPr>
-              <w:t>0.0629</w:t>
+              <w:t>0.06</w:t>
+            </w:r>
+            <w:r>
+              <w:rPr>
+                <w:highlight w:val="yellow"/>
+              </w:rPr>
+              <w:t>3</w:t>
             </w:r>
           </w:p>
         </w:tc>
@@ -5873,7 +5778,13 @@
               <w:rPr>
                 <w:highlight w:val="yellow"/>
               </w:rPr>
-              <w:t>0.896</w:t>
+              <w:t>0.89</w:t>
+            </w:r>
+            <w:r>
+              <w:rPr>
+                <w:highlight w:val="yellow"/>
+              </w:rPr>
+              <w:t>89</w:t>
             </w:r>
           </w:p>
         </w:tc>
@@ -5897,7 +5808,13 @@
               <w:rPr>
                 <w:highlight w:val="yellow"/>
               </w:rPr>
-              <w:t>0.0629</w:t>
+              <w:t>0.06</w:t>
+            </w:r>
+            <w:r>
+              <w:rPr>
+                <w:highlight w:val="yellow"/>
+              </w:rPr>
+              <w:t>3</w:t>
             </w:r>
           </w:p>
         </w:tc>
@@ -5974,7 +5891,13 @@
               <w:rPr>
                 <w:highlight w:val="yellow"/>
               </w:rPr>
-              <w:t>2.3379</w:t>
+              <w:t>2.3</w:t>
+            </w:r>
+            <w:r>
+              <w:rPr>
+                <w:highlight w:val="yellow"/>
+              </w:rPr>
+              <w:t>041</w:t>
             </w:r>
           </w:p>
         </w:tc>
@@ -5998,7 +5921,13 @@
               <w:rPr>
                 <w:highlight w:val="yellow"/>
               </w:rPr>
-              <w:t>0.0868</w:t>
+              <w:t>0.086</w:t>
+            </w:r>
+            <w:r>
+              <w:rPr>
+                <w:highlight w:val="yellow"/>
+              </w:rPr>
+              <w:t>9</w:t>
             </w:r>
           </w:p>
         </w:tc>
@@ -6072,7 +6001,13 @@
               <w:rPr>
                 <w:highlight w:val="yellow"/>
               </w:rPr>
-              <w:t>0.1668</w:t>
+              <w:t>0.</w:t>
+            </w:r>
+            <w:r>
+              <w:rPr>
+                <w:highlight w:val="yellow"/>
+              </w:rPr>
+              <w:t>2056</w:t>
             </w:r>
           </w:p>
         </w:tc>
@@ -6095,7 +6030,13 @@
               <w:rPr>
                 <w:highlight w:val="yellow"/>
               </w:rPr>
-              <w:t>0.0868</w:t>
+              <w:t>0.086</w:t>
+            </w:r>
+            <w:r>
+              <w:rPr>
+                <w:highlight w:val="yellow"/>
+              </w:rPr>
+              <w:t>9</w:t>
             </w:r>
           </w:p>
         </w:tc>
@@ -6112,7 +6053,13 @@
       </w:pPr>
       <w:r>
         <w:lastRenderedPageBreak/>
-        <w:t>8.1. Batch Size Selection</w:t>
+        <w:t>8.</w:t>
+      </w:r>
+      <w:r>
+        <w:t>3</w:t>
+      </w:r>
+      <w:r>
+        <w:t>. Batch Size Selection</w:t>
       </w:r>
     </w:p>
     <w:p>
@@ -6282,13 +6229,22 @@
       </w:r>
       <w:proofErr w:type="gramEnd"/>
       <w:r>
-        <w:t xml:space="preserve"> ONNX model demonstrated the second-highest performance. </w:t>
-      </w:r>
-      <w:r>
-        <w:rPr>
-          <w:highlight w:val="cyan"/>
-        </w:rPr>
-        <w:t>However, it was observed to fall behind the standard ONNX model at smaller batch sizes</w:t>
+        <w:t xml:space="preserve"> ONNX model demonstrated the second-highest performance</w:t>
+      </w:r>
+      <w:r>
+        <w:t xml:space="preserve">. However, it was observed to fall behind the </w:t>
+      </w:r>
+      <w:r>
+        <w:t>other</w:t>
+      </w:r>
+      <w:r>
+        <w:t xml:space="preserve"> ONNX </w:t>
+      </w:r>
+      <w:r>
+        <w:t>variants</w:t>
+      </w:r>
+      <w:r>
+        <w:t xml:space="preserve"> at smaller batch sizes</w:t>
       </w:r>
       <w:r>
         <w:t>.</w:t>
@@ -6717,47 +6673,60 @@
       </w:pPr>
       <w:r>
         <w:rPr>
-          <w:highlight w:val="cyan"/>
-        </w:rPr>
-        <w:t xml:space="preserve">In addition to quantization, advanced processing techniques such as model simplification via ONNX Simplifier and graph-level optimization were evaluated; however, these steps did not yield meaningful performance gains. Experimental observations revealed that graph optimization specifically increased latency by </w:t>
-      </w:r>
-      <w:r>
-        <w:rPr>
-          <w:highlight w:val="cyan"/>
-        </w:rPr>
-        <w:t>twofold</w:t>
-      </w:r>
-      <w:r>
-        <w:rPr>
-          <w:highlight w:val="cyan"/>
-        </w:rPr>
-        <w:t>. Consequently, such additional processes are unnecessary for the model</w:t>
-      </w:r>
-      <w:r>
-        <w:rPr>
-          <w:highlight w:val="cyan"/>
-        </w:rPr>
-        <w:t>s</w:t>
-      </w:r>
-      <w:r>
-        <w:rPr>
-          <w:highlight w:val="cyan"/>
-        </w:rPr>
-        <w:t xml:space="preserve"> utilized in this study.</w:t>
+          <w:highlight w:val="yellow"/>
+        </w:rPr>
+        <w:t>While the optimization pipelines evaluated in this study demonstrate significant performance acceleration, it is important to establish that all absolute execution times and latency ceilings documented in this work are fundamentally hardware dependent. The benchmarking suite was executed on an enterprise-grade computing stack comprising an Intel Xeon processor and an NVIDIA A100 Tensor Core GPU.</w:t>
+      </w:r>
+      <w:r>
+        <w:rPr>
+          <w:highlight w:val="yellow"/>
+        </w:rPr>
+        <w:t xml:space="preserve"> </w:t>
+      </w:r>
+      <w:r>
+        <w:rPr>
+          <w:highlight w:val="yellow"/>
+        </w:rPr>
+        <w:t xml:space="preserve">Deploying these compiled and </w:t>
+      </w:r>
+      <w:proofErr w:type="gramStart"/>
+      <w:r>
+        <w:rPr>
+          <w:highlight w:val="yellow"/>
+        </w:rPr>
+        <w:t>quantized</w:t>
+      </w:r>
+      <w:proofErr w:type="gramEnd"/>
+      <w:r>
+        <w:rPr>
+          <w:highlight w:val="yellow"/>
+        </w:rPr>
+        <w:t xml:space="preserve"> architectures on alternative execution environments such as commodity host CPUs, standard user workstations, or resource-constrained edge gateways will yield higher absolute execution latencies. However, the relative speedup trends are expected to remain consistent across different computing platforms.</w:t>
       </w:r>
     </w:p>
     <w:p>
       <w:pPr>
         <w:pStyle w:val="MDPI31text"/>
-        <w:rPr>
-          <w:highlight w:val="yellow"/>
-        </w:rPr>
-      </w:pPr>
-      <w:r>
-        <w:rPr>
-          <w:highlight w:val="yellow"/>
-        </w:rPr>
-        <w:t>While the optimization pipelines evaluated in this study demonstrate significant performance acceleration, it is important to establish that all absolute execution times and latency ceilings documented in this work are fundamentally hardware dependent. The benchmarking suite was executed on an enterprise-grade computing stack comprising an Intel Xeon processor and an NVIDIA A100 Tensor Core GPU.</w:t>
+      </w:pPr>
+      <w:r>
+        <w:rPr>
+          <w:highlight w:val="yellow"/>
+        </w:rPr>
+        <w:t xml:space="preserve">In conclusion, this research presents a systematic comparison of compilers (ONNX) and quantization configurations across multiple architectures (MLP, CNN, GRU) on a unified reference platform. The findings guide cybersecurity experts in designing operational systems and developing low-latency, scalable defense </w:t>
+      </w:r>
+      <w:proofErr w:type="gramStart"/>
+      <w:r>
+        <w:rPr>
+          <w:highlight w:val="yellow"/>
+        </w:rPr>
+        <w:t>architectures</w:t>
+      </w:r>
+      <w:proofErr w:type="gramEnd"/>
+      <w:r>
+        <w:rPr>
+          <w:highlight w:val="yellow"/>
+        </w:rPr>
+        <w:t>.</w:t>
       </w:r>
     </w:p>
     <w:p>
@@ -6768,150 +6737,242 @@
         <w:rPr>
           <w:highlight w:val="yellow"/>
         </w:rPr>
-        <w:t xml:space="preserve">Deploying these compiled and </w:t>
+        <w:t xml:space="preserve">To build upon these findings, our future work will focus on performing an end-to-end hardware-in-the-loop system evaluation, integrating our optimized models with kernel-level frameworks like </w:t>
+      </w:r>
+      <w:proofErr w:type="spellStart"/>
+      <w:r>
+        <w:rPr>
+          <w:highlight w:val="yellow"/>
+        </w:rPr>
+        <w:t>eBPF</w:t>
+      </w:r>
+      <w:proofErr w:type="spellEnd"/>
+      <w:r>
+        <w:rPr>
+          <w:highlight w:val="yellow"/>
+        </w:rPr>
+        <w:t>/XDP and hardware-accelerated interfaces like DPDK to empirically measure overall system latency under high-bandwidth, live traffic conditions.</w:t>
+      </w:r>
+    </w:p>
+    <w:p>
+      <w:pPr>
+        <w:pStyle w:val="MDPI31text"/>
+      </w:pPr>
+    </w:p>
+    <w:p>
+      <w:pPr>
+        <w:pStyle w:val="MDPI62backmatter"/>
+      </w:pPr>
+      <w:r>
+        <w:rPr>
+          <w:b/>
+        </w:rPr>
+        <w:t xml:space="preserve">Author Contributions: </w:t>
+      </w:r>
+      <w:r>
+        <w:t xml:space="preserve">Conceptualization, İ.O.; methodology, </w:t>
+      </w:r>
+      <w:r>
+        <w:t>İ.Ö</w:t>
+      </w:r>
+      <w:r>
+        <w:t xml:space="preserve">.; </w:t>
+      </w:r>
+      <w:r>
+        <w:t xml:space="preserve">investigation, </w:t>
+      </w:r>
+      <w:r>
+        <w:t>S.E.,</w:t>
+      </w:r>
+      <w:r>
+        <w:t xml:space="preserve"> and A.G.; </w:t>
+      </w:r>
+      <w:r>
+        <w:t xml:space="preserve">validation, </w:t>
+      </w:r>
+      <w:r>
+        <w:t>S.E.,</w:t>
+      </w:r>
+      <w:r>
+        <w:t xml:space="preserve"> and</w:t>
+      </w:r>
+      <w:r>
+        <w:t xml:space="preserve"> A.G</w:t>
+      </w:r>
+      <w:r>
+        <w:t>.</w:t>
+      </w:r>
+      <w:r>
+        <w:t>;</w:t>
+      </w:r>
+      <w:r>
+        <w:t xml:space="preserve"> software, </w:t>
+      </w:r>
+      <w:r>
+        <w:t>S.E.,</w:t>
+      </w:r>
+      <w:r>
+        <w:t xml:space="preserve"> and A.G.; </w:t>
+      </w:r>
+      <w:r>
+        <w:t xml:space="preserve">writing—original draft preparation, </w:t>
+      </w:r>
+      <w:r>
+        <w:t>S.E.,</w:t>
+      </w:r>
+      <w:r>
+        <w:t xml:space="preserve"> </w:t>
+      </w:r>
+      <w:r>
+        <w:t>A.G.</w:t>
+      </w:r>
+      <w:r>
+        <w:t xml:space="preserve"> and Ö.Ö.</w:t>
+      </w:r>
+      <w:r>
+        <w:t>; writing—review and editing, İ.O.; supervision, İ.O. All authors have read and agreed to the published version of the manuscript.</w:t>
+      </w:r>
+    </w:p>
+    <w:p>
+      <w:pPr>
+        <w:pStyle w:val="MDPI62backmatter"/>
+      </w:pPr>
+      <w:r>
+        <w:rPr>
+          <w:b/>
+        </w:rPr>
+        <w:t xml:space="preserve">Funding: </w:t>
+      </w:r>
+      <w:r>
+        <w:t xml:space="preserve">This research was funded by Doruk İletişim </w:t>
+      </w:r>
+      <w:proofErr w:type="spellStart"/>
+      <w:r>
+        <w:t>ve</w:t>
+      </w:r>
+      <w:proofErr w:type="spellEnd"/>
+      <w:r>
+        <w:t xml:space="preserve"> </w:t>
+      </w:r>
+      <w:proofErr w:type="spellStart"/>
+      <w:r>
+        <w:t>Otomasyon</w:t>
+      </w:r>
+      <w:proofErr w:type="spellEnd"/>
+      <w:r>
+        <w:t xml:space="preserve"> Sanayi </w:t>
+      </w:r>
+      <w:proofErr w:type="spellStart"/>
+      <w:r>
+        <w:t>ve</w:t>
+      </w:r>
+      <w:proofErr w:type="spellEnd"/>
+      <w:r>
+        <w:t xml:space="preserve"> Ticaret A.Ş. (DORUKNET) under funding number </w:t>
       </w:r>
       <w:proofErr w:type="gramStart"/>
       <w:r>
-        <w:rPr>
-          <w:highlight w:val="yellow"/>
-        </w:rPr>
-        <w:t>quantized</w:t>
+        <w:t>DRK.BGDT.DDOS</w:t>
       </w:r>
       <w:proofErr w:type="gramEnd"/>
       <w:r>
-        <w:rPr>
-          <w:highlight w:val="yellow"/>
-        </w:rPr>
-        <w:t xml:space="preserve"> architectures on alternative execution environments such as commodity host CPUs, standard user workstations, or resource-constrained edge gateways will yield higher absolute execution latencies. However, the relative speedup trends are expected to remain consistent across different computing platforms.</w:t>
-      </w:r>
-    </w:p>
-    <w:p>
-      <w:pPr>
-        <w:pStyle w:val="MDPI31text"/>
-      </w:pPr>
-      <w:r>
-        <w:rPr>
-          <w:highlight w:val="yellow"/>
-        </w:rPr>
-        <w:t xml:space="preserve">In conclusion, this research presents a systematic comparison of compilers (ONNX) and quantization configurations across multiple architectures (MLP, CNN, GRU) on a unified reference platform. The findings guide cybersecurity experts in designing operational systems and developing low-latency, scalable defense </w:t>
-      </w:r>
-      <w:proofErr w:type="gramStart"/>
-      <w:r>
-        <w:rPr>
-          <w:highlight w:val="yellow"/>
-        </w:rPr>
-        <w:t>architectures</w:t>
-      </w:r>
-      <w:proofErr w:type="gramEnd"/>
-      <w:r>
-        <w:rPr>
-          <w:highlight w:val="yellow"/>
-        </w:rPr>
+        <w:t>.001</w:t>
+      </w:r>
+      <w:r>
         <w:t>.</w:t>
       </w:r>
     </w:p>
     <w:p>
       <w:pPr>
-        <w:pStyle w:val="MDPI31text"/>
-      </w:pPr>
-      <w:r>
-        <w:rPr>
-          <w:highlight w:val="yellow"/>
-        </w:rPr>
-        <w:t xml:space="preserve">To build upon these findings, our future work will focus on performing an end-to-end hardware-in-the-loop system evaluation, integrating our optimized models with kernel-level frameworks like </w:t>
-      </w:r>
-      <w:proofErr w:type="spellStart"/>
-      <w:r>
-        <w:rPr>
-          <w:highlight w:val="yellow"/>
-        </w:rPr>
-        <w:t>eBPF</w:t>
-      </w:r>
-      <w:proofErr w:type="spellEnd"/>
-      <w:r>
-        <w:rPr>
-          <w:highlight w:val="yellow"/>
-        </w:rPr>
-        <w:t>/XDP and hardware-accelerated interfaces like DPDK to empirically measure overall system latency under high-bandwidth, live traffic conditions.</w:t>
-      </w:r>
-    </w:p>
-    <w:p>
-      <w:pPr>
-        <w:pStyle w:val="MDPI31text"/>
-      </w:pPr>
-    </w:p>
-    <w:p>
-      <w:pPr>
         <w:pStyle w:val="MDPI62backmatter"/>
       </w:pPr>
       <w:r>
         <w:rPr>
           <w:b/>
         </w:rPr>
-        <w:t xml:space="preserve">Author Contributions: </w:t>
-      </w:r>
-      <w:r>
-        <w:t xml:space="preserve">Conceptualization, İ.O.; methodology, </w:t>
-      </w:r>
-      <w:r>
-        <w:t>İ.Ö</w:t>
-      </w:r>
-      <w:r>
-        <w:t xml:space="preserve">.; </w:t>
-      </w:r>
-      <w:r>
-        <w:t xml:space="preserve">investigation, </w:t>
-      </w:r>
-      <w:r>
-        <w:t>S.E.,</w:t>
-      </w:r>
-      <w:r>
-        <w:t xml:space="preserve"> and A.G.; </w:t>
-      </w:r>
-      <w:r>
-        <w:t xml:space="preserve">validation, </w:t>
-      </w:r>
-      <w:r>
-        <w:t>S.E.,</w:t>
-      </w:r>
-      <w:r>
-        <w:t xml:space="preserve"> and</w:t>
-      </w:r>
-      <w:r>
-        <w:t xml:space="preserve"> A.G</w:t>
+        <w:t xml:space="preserve">Data Availability Statement: </w:t>
+      </w:r>
+      <w:r>
+        <w:t xml:space="preserve">The original contributions presented in this study are included in the article. Further inquiries can be directed </w:t>
+      </w:r>
+      <w:r>
+        <w:t>at</w:t>
+      </w:r>
+      <w:r>
+        <w:t xml:space="preserve"> the corresponding author</w:t>
       </w:r>
       <w:r>
         <w:t>.</w:t>
       </w:r>
-      <w:r>
-        <w:t>;</w:t>
-      </w:r>
-      <w:r>
-        <w:t xml:space="preserve"> software, </w:t>
-      </w:r>
-      <w:r>
-        <w:t>S.E.,</w:t>
-      </w:r>
-      <w:r>
-        <w:t xml:space="preserve"> and A.G.; </w:t>
-      </w:r>
-      <w:r>
-        <w:t xml:space="preserve">writing—original draft preparation, </w:t>
-      </w:r>
-      <w:r>
-        <w:t>S.E.,</w:t>
-      </w:r>
+    </w:p>
+    <w:p>
+      <w:pPr>
+        <w:pStyle w:val="MDPI62backmatter"/>
+      </w:pPr>
+      <w:r>
+        <w:rPr>
+          <w:b/>
+        </w:rPr>
+        <w:t xml:space="preserve">Acknowledgments: </w:t>
+      </w:r>
+      <w:r>
+        <w:t xml:space="preserve">This material is based upon work supported by Doruk İletişim </w:t>
+      </w:r>
+      <w:proofErr w:type="spellStart"/>
+      <w:r>
+        <w:t>ve</w:t>
+      </w:r>
+      <w:proofErr w:type="spellEnd"/>
       <w:r>
         <w:t xml:space="preserve"> </w:t>
       </w:r>
-      <w:r>
-        <w:t>A.G.</w:t>
-      </w:r>
-      <w:r>
-        <w:t xml:space="preserve"> and Ö.Ö.</w:t>
-      </w:r>
-      <w:r>
-        <w:t>; writing—review and editing, İ.O.; supervision, İ.O. All authors have read and agreed to the published version of the manuscript.</w:t>
+      <w:proofErr w:type="spellStart"/>
+      <w:r>
+        <w:t>Otomasyon</w:t>
+      </w:r>
+      <w:proofErr w:type="spellEnd"/>
+      <w:r>
+        <w:t xml:space="preserve"> Sanayi </w:t>
+      </w:r>
+      <w:proofErr w:type="spellStart"/>
+      <w:r>
+        <w:t>ve</w:t>
+      </w:r>
+      <w:proofErr w:type="spellEnd"/>
+      <w:r>
+        <w:t xml:space="preserve"> Ticaret A.Ş. (DORUKNET). The authors gratefully acknowledge this support and take responsibility for the contents of this report. The views and conclusions contained herein are those of the authors and should not be interpreted as necessarily representing the official policies or endorsements, either expressed or implied, of Doruk </w:t>
+      </w:r>
+      <w:proofErr w:type="spellStart"/>
+      <w:r>
+        <w:t>İletişim</w:t>
+      </w:r>
+      <w:proofErr w:type="spellEnd"/>
+      <w:r>
+        <w:t xml:space="preserve"> </w:t>
+      </w:r>
+      <w:proofErr w:type="spellStart"/>
+      <w:r>
+        <w:t>ve</w:t>
+      </w:r>
+      <w:proofErr w:type="spellEnd"/>
+      <w:r>
+        <w:t xml:space="preserve"> </w:t>
+      </w:r>
+      <w:proofErr w:type="spellStart"/>
+      <w:r>
+        <w:t>Otomasyon</w:t>
+      </w:r>
+      <w:proofErr w:type="spellEnd"/>
+      <w:r>
+        <w:t xml:space="preserve"> Sanayi </w:t>
+      </w:r>
+      <w:proofErr w:type="spellStart"/>
+      <w:r>
+        <w:t>ve</w:t>
+      </w:r>
+      <w:proofErr w:type="spellEnd"/>
+      <w:r>
+        <w:t xml:space="preserve"> Ticaret A.Ş. (DORUKNET).</w:t>
       </w:r>
     </w:p>
     <w:p>
@@ -6921,277 +6982,135 @@
       <w:r>
         <w:rPr>
           <w:b/>
-        </w:rPr>
-        <w:t xml:space="preserve">Funding: </w:t>
-      </w:r>
-      <w:r>
-        <w:t xml:space="preserve">This research was funded by Doruk İletişim </w:t>
-      </w:r>
-      <w:proofErr w:type="spellStart"/>
-      <w:r>
+          <w:highlight w:val="yellow"/>
+        </w:rPr>
+        <w:t xml:space="preserve">Conflicts of Interest: </w:t>
+      </w:r>
+      <w:r>
+        <w:rPr>
+          <w:highlight w:val="yellow"/>
+        </w:rPr>
+        <w:t>The authors declare that this study received</w:t>
+      </w:r>
+      <w:r>
+        <w:rPr>
+          <w:rFonts w:ascii="Times New Roman" w:hAnsi="Times New Roman"/>
+          <w:highlight w:val="yellow"/>
+        </w:rPr>
+        <w:t> </w:t>
+      </w:r>
+      <w:r>
+        <w:rPr>
+          <w:highlight w:val="yellow"/>
+        </w:rPr>
+        <w:t>funding</w:t>
+      </w:r>
+      <w:r>
+        <w:rPr>
+          <w:rFonts w:ascii="Times New Roman" w:hAnsi="Times New Roman"/>
+          <w:highlight w:val="yellow"/>
+        </w:rPr>
+        <w:t> </w:t>
+      </w:r>
+      <w:r>
+        <w:rPr>
+          <w:highlight w:val="yellow"/>
+        </w:rPr>
+        <w:t xml:space="preserve">from Doruk </w:t>
+      </w:r>
+      <w:proofErr w:type="spellStart"/>
+      <w:r>
+        <w:rPr>
+          <w:highlight w:val="yellow"/>
+        </w:rPr>
+        <w:t>İletişim</w:t>
+      </w:r>
+      <w:proofErr w:type="spellEnd"/>
+      <w:r>
+        <w:rPr>
+          <w:highlight w:val="yellow"/>
+        </w:rPr>
+        <w:t xml:space="preserve"> </w:t>
+      </w:r>
+      <w:proofErr w:type="spellStart"/>
+      <w:r>
+        <w:rPr>
+          <w:highlight w:val="yellow"/>
+        </w:rPr>
         <w:t>ve</w:t>
       </w:r>
       <w:proofErr w:type="spellEnd"/>
       <w:r>
+        <w:rPr>
+          <w:highlight w:val="yellow"/>
+        </w:rPr>
         <w:t xml:space="preserve"> </w:t>
       </w:r>
       <w:proofErr w:type="spellStart"/>
       <w:r>
+        <w:rPr>
+          <w:highlight w:val="yellow"/>
+        </w:rPr>
         <w:t>Otomasyon</w:t>
       </w:r>
       <w:proofErr w:type="spellEnd"/>
       <w:r>
+        <w:rPr>
+          <w:highlight w:val="yellow"/>
+        </w:rPr>
         <w:t xml:space="preserve"> Sanayi </w:t>
       </w:r>
       <w:proofErr w:type="spellStart"/>
       <w:r>
+        <w:rPr>
+          <w:highlight w:val="yellow"/>
+        </w:rPr>
         <w:t>ve</w:t>
       </w:r>
       <w:proofErr w:type="spellEnd"/>
       <w:r>
-        <w:t xml:space="preserve"> Ticaret A.Ş. (DORUKNET) under funding number </w:t>
-      </w:r>
-      <w:proofErr w:type="gramStart"/>
-      <w:r>
-        <w:t>DRK.BGDT.DDOS</w:t>
-      </w:r>
-      <w:proofErr w:type="gramEnd"/>
-      <w:r>
-        <w:t>.001</w:t>
-      </w:r>
-      <w:r>
+        <w:rPr>
+          <w:highlight w:val="yellow"/>
+        </w:rPr>
+        <w:t xml:space="preserve"> Ticaret A.Ş. (DORUKNET). The funder was not involved in the study design, collection, analysis, interpretation of data, the writing of this article or the decision to submit it for publication</w:t>
+      </w:r>
+      <w:r>
+        <w:rPr>
+          <w:highlight w:val="yellow"/>
+        </w:rPr>
         <w:t>.</w:t>
       </w:r>
     </w:p>
     <w:p>
       <w:pPr>
-        <w:pStyle w:val="MDPI62backmatter"/>
-      </w:pPr>
-      <w:r>
-        <w:rPr>
-          <w:b/>
-        </w:rPr>
-        <w:t xml:space="preserve">Data Availability Statement: </w:t>
-      </w:r>
-      <w:r>
-        <w:t xml:space="preserve">The original contributions presented in this study are included in the article. Further inquiries can be directed </w:t>
-      </w:r>
-      <w:r>
-        <w:t>at</w:t>
-      </w:r>
-      <w:r>
-        <w:t xml:space="preserve"> the corresponding author</w:t>
-      </w:r>
-      <w:r>
-        <w:t>.</w:t>
-      </w:r>
-    </w:p>
-    <w:p>
-      <w:pPr>
-        <w:pStyle w:val="MDPI62backmatter"/>
-      </w:pPr>
-      <w:r>
-        <w:rPr>
-          <w:b/>
-        </w:rPr>
-        <w:t xml:space="preserve">Acknowledgments: </w:t>
-      </w:r>
-      <w:r>
-        <w:t xml:space="preserve">This material is based upon work supported by Doruk İletişim </w:t>
-      </w:r>
-      <w:proofErr w:type="spellStart"/>
-      <w:r>
-        <w:t>ve</w:t>
-      </w:r>
-      <w:proofErr w:type="spellEnd"/>
-      <w:r>
-        <w:t xml:space="preserve"> </w:t>
-      </w:r>
-      <w:proofErr w:type="spellStart"/>
-      <w:r>
-        <w:t>Otomasyon</w:t>
-      </w:r>
-      <w:proofErr w:type="spellEnd"/>
-      <w:r>
-        <w:t xml:space="preserve"> Sanayi </w:t>
-      </w:r>
-      <w:proofErr w:type="spellStart"/>
-      <w:r>
-        <w:t>ve</w:t>
-      </w:r>
-      <w:proofErr w:type="spellEnd"/>
-      <w:r>
-        <w:t xml:space="preserve"> Ticaret A.Ş. (DORUKNET). The authors gratefully acknowledge this support and take responsibility for the contents of this report. The views and conclusions contained herein are those of the authors and should not be interpreted as necessarily representing the official policies or endorsements, either expressed or implied, of Doruk </w:t>
-      </w:r>
-      <w:proofErr w:type="spellStart"/>
-      <w:r>
-        <w:t>İletişim</w:t>
-      </w:r>
-      <w:proofErr w:type="spellEnd"/>
-      <w:r>
-        <w:t xml:space="preserve"> </w:t>
-      </w:r>
-      <w:proofErr w:type="spellStart"/>
-      <w:r>
-        <w:t>ve</w:t>
-      </w:r>
-      <w:proofErr w:type="spellEnd"/>
-      <w:r>
-        <w:t xml:space="preserve"> </w:t>
-      </w:r>
-      <w:proofErr w:type="spellStart"/>
-      <w:r>
-        <w:t>Otomasyon</w:t>
-      </w:r>
-      <w:proofErr w:type="spellEnd"/>
-      <w:r>
-        <w:t xml:space="preserve"> Sanayi </w:t>
-      </w:r>
-      <w:proofErr w:type="spellStart"/>
-      <w:r>
-        <w:t>ve</w:t>
-      </w:r>
-      <w:proofErr w:type="spellEnd"/>
-      <w:r>
-        <w:t xml:space="preserve"> Ticaret A.Ş. (DORUKNET).</w:t>
-      </w:r>
-    </w:p>
-    <w:p>
-      <w:pPr>
-        <w:pStyle w:val="MDPI62backmatter"/>
-      </w:pPr>
-      <w:r>
-        <w:rPr>
-          <w:b/>
-          <w:highlight w:val="yellow"/>
-        </w:rPr>
-        <w:t xml:space="preserve">Conflicts of Interest: </w:t>
-      </w:r>
-      <w:r>
-        <w:rPr>
-          <w:highlight w:val="yellow"/>
-        </w:rPr>
-        <w:t>The authors declare that this study received</w:t>
-      </w:r>
-      <w:r>
-        <w:rPr>
-          <w:rFonts w:ascii="Times New Roman" w:hAnsi="Times New Roman"/>
-          <w:highlight w:val="yellow"/>
-        </w:rPr>
-        <w:t> </w:t>
-      </w:r>
-      <w:r>
-        <w:rPr>
-          <w:highlight w:val="yellow"/>
-        </w:rPr>
-        <w:t>funding</w:t>
-      </w:r>
-      <w:r>
-        <w:rPr>
-          <w:rFonts w:ascii="Times New Roman" w:hAnsi="Times New Roman"/>
-          <w:highlight w:val="yellow"/>
-        </w:rPr>
-        <w:t> </w:t>
-      </w:r>
-      <w:r>
-        <w:rPr>
-          <w:highlight w:val="yellow"/>
-        </w:rPr>
-        <w:t xml:space="preserve">from Doruk </w:t>
-      </w:r>
-      <w:proofErr w:type="spellStart"/>
-      <w:r>
-        <w:rPr>
-          <w:highlight w:val="yellow"/>
-        </w:rPr>
-        <w:t>İletişim</w:t>
-      </w:r>
-      <w:proofErr w:type="spellEnd"/>
-      <w:r>
-        <w:rPr>
-          <w:highlight w:val="yellow"/>
-        </w:rPr>
-        <w:t xml:space="preserve"> </w:t>
-      </w:r>
-      <w:proofErr w:type="spellStart"/>
-      <w:r>
-        <w:rPr>
-          <w:highlight w:val="yellow"/>
-        </w:rPr>
-        <w:t>ve</w:t>
-      </w:r>
-      <w:proofErr w:type="spellEnd"/>
-      <w:r>
-        <w:rPr>
-          <w:highlight w:val="yellow"/>
-        </w:rPr>
-        <w:t xml:space="preserve"> </w:t>
-      </w:r>
-      <w:proofErr w:type="spellStart"/>
-      <w:r>
-        <w:rPr>
-          <w:highlight w:val="yellow"/>
-        </w:rPr>
-        <w:t>Otomasyon</w:t>
-      </w:r>
-      <w:proofErr w:type="spellEnd"/>
-      <w:r>
-        <w:rPr>
-          <w:highlight w:val="yellow"/>
-        </w:rPr>
-        <w:t xml:space="preserve"> Sanayi </w:t>
-      </w:r>
-      <w:proofErr w:type="spellStart"/>
-      <w:r>
-        <w:rPr>
-          <w:highlight w:val="yellow"/>
-        </w:rPr>
-        <w:t>ve</w:t>
-      </w:r>
-      <w:proofErr w:type="spellEnd"/>
-      <w:r>
-        <w:rPr>
-          <w:highlight w:val="yellow"/>
-        </w:rPr>
-        <w:t xml:space="preserve"> Ticaret A.Ş. (DORUKNET). The funder was not involved in the study design, collection, analysis, interpretation of data, the writing of this article or the decision to submit it for publication</w:t>
-      </w:r>
-      <w:r>
-        <w:rPr>
-          <w:highlight w:val="yellow"/>
-        </w:rPr>
-        <w:t>.</w:t>
-      </w:r>
-    </w:p>
-    <w:p>
-      <w:pPr>
         <w:pStyle w:val="MDPI21heading1"/>
       </w:pPr>
       <w:r>
+        <w:t>References</w:t>
+      </w:r>
+    </w:p>
+    <w:p>
+      <w:pPr>
+        <w:pStyle w:val="MDPI81references"/>
+      </w:pPr>
+      <w:r>
+        <w:t xml:space="preserve">1. </w:t>
+      </w:r>
+      <w:proofErr w:type="spellStart"/>
+      <w:r>
+        <w:t>Shohan</w:t>
+      </w:r>
+      <w:proofErr w:type="spellEnd"/>
+      <w:r>
+        <w:t>, N.J.; et al. Enhancing network security: A hybrid approach for detection and mitigation of distributed denial-of-service attacks using machine learning. In Proceedings of the International Conference on Advanced Network Technologies and Intelligent Computing; Springer: Cham, Switzerland, 2023; pp. 81–95.</w:t>
+      </w:r>
+    </w:p>
+    <w:p>
+      <w:pPr>
+        <w:pStyle w:val="MDPI81references"/>
+      </w:pPr>
+      <w:r>
         <w:lastRenderedPageBreak/>
-        <w:t>References</w:t>
-      </w:r>
-    </w:p>
-    <w:p>
-      <w:pPr>
-        <w:pStyle w:val="MDPI81references"/>
-      </w:pPr>
-      <w:r>
-        <w:t xml:space="preserve">1. </w:t>
-      </w:r>
-      <w:proofErr w:type="spellStart"/>
-      <w:r>
-        <w:t>Shohan</w:t>
-      </w:r>
-      <w:proofErr w:type="spellEnd"/>
-      <w:r>
-        <w:t>, N.J.; et al. Enhancing network security: A hybrid approach for detection and mitigation of distributed denial-of-service attacks using machine learning. In Proceedings of the International Conference on Advanced Network Technologies and Intelligent Computing; Springer: Cham, Switzerland, 2023; pp. 81–95.</w:t>
-      </w:r>
-    </w:p>
-    <w:p>
-      <w:pPr>
-        <w:pStyle w:val="MDPI81references"/>
-      </w:pPr>
-      <w:r>
         <w:t xml:space="preserve">2. Dummer, S.H.; Rath, S. A retrospective on </w:t>
       </w:r>
       <w:proofErr w:type="spellStart"/>

</xml_diff>